<commit_message>
refactor: đổi tên BaseCore.* sang Zewvron.*, TechStore sang Zewvron (chuỗi hiển thị)
</commit_message>
<xml_diff>
--- a/docs/file/SDD_ThietKeChiTietHam.docx
+++ b/docs/file/SDD_ThietKeChiTietHam.docx
@@ -15,7 +15,7 @@
           <w:sz w:val="30"/>
           <w:szCs w:val="30"/>
         </w:rPr>
-        <w:t xml:space="preserve">TECHSTORE</w:t>
+        <w:t xml:space="preserve">ZEWVRON</w:t>
       </w:r>
     </w:p>
     <w:p>
@@ -10089,7 +10089,7 @@
         <w:sz w:val="18"/>
         <w:szCs w:val="18"/>
       </w:rPr>
-      <w:t xml:space="preserve">TechStore – Thiết kế chi tiết các hàm</w:t>
+      <w:t xml:space="preserve">Zewvron – Thiết kế chi tiết các hàm</w:t>
     </w:r>
   </w:p>
 </w:hdr>

</xml_diff>